<commit_message>
UPdate Cv link 3
</commit_message>
<xml_diff>
--- a/public/Tommy_Vong_Senior_Full_Stack_Engineer.docx
+++ b/public/Tommy_Vong_Senior_Full_Stack_Engineer.docx
@@ -57,9 +57,69 @@
         </w:rPr>
         <w:t xml:space="preserve">Senior Full Stack Engineer</w:t>
         <w:br/>
-        <w:t xml:space="preserve">Los Angeles, CA | 626-340-5864 | tommyvong88@gmail.com | tommyvong.com</w:t>
-        <w:br/>
-      </w:r>
+        <w:t xml:space="preserve">Los Angeles, CA | 626-340-5864 | tommyvong88@gmail.com </w:t>
+      </w:r>
+    </w:p>
+    <w:p>
+      <w:pPr>
+        <w:keepNext w:val="true"/>
+        <w:keepLines w:val="true"/>
+        <w:spacing w:before="200" w:after="0" w:line="276"/>
+        <w:ind w:right="0" w:left="0" w:firstLine="0"/>
+        <w:jc w:val="left"/>
+        <w:rPr>
+          <w:rFonts w:ascii="Cambria" w:hAnsi="Cambria" w:cs="Cambria" w:eastAsia="Cambria"/>
+          <w:color w:val="auto"/>
+          <w:spacing w:val="0"/>
+          <w:position w:val="0"/>
+          <w:sz w:val="22"/>
+          <w:shd w:fill="auto" w:val="clear"/>
+        </w:rPr>
+      </w:pPr>
+      <w:r>
+        <w:rPr>
+          <w:rFonts w:ascii="Calibri" w:hAnsi="Calibri" w:cs="Calibri" w:eastAsia="Calibri"/>
+          <w:b/>
+          <w:color w:val="4F81BD"/>
+          <w:spacing w:val="0"/>
+          <w:position w:val="0"/>
+          <w:sz w:val="26"/>
+          <w:shd w:fill="auto" w:val="clear"/>
+        </w:rPr>
+        <w:t xml:space="preserve">ONLINE PORTFOLIO</w:t>
+        <w:br/>
+      </w:r>
+      <w:hyperlink xmlns:r="http://schemas.openxmlformats.org/officeDocument/2006/relationships" r:id="docRId0">
+        <w:r>
+          <w:rPr>
+            <w:rFonts w:ascii="Cambria" w:hAnsi="Cambria" w:cs="Cambria" w:eastAsia="Cambria"/>
+            <w:color w:val="0000FF"/>
+            <w:spacing w:val="0"/>
+            <w:position w:val="0"/>
+            <w:sz w:val="22"/>
+            <w:u w:val="single"/>
+            <w:shd w:fill="auto" w:val="clear"/>
+          </w:rPr>
+          <w:t xml:space="preserve">www.tommyvong.com</w:t>
+        </w:r>
+      </w:hyperlink>
+    </w:p>
+    <w:p>
+      <w:pPr>
+        <w:keepNext w:val="true"/>
+        <w:keepLines w:val="true"/>
+        <w:spacing w:before="200" w:after="0" w:line="276"/>
+        <w:ind w:right="0" w:left="0" w:firstLine="0"/>
+        <w:jc w:val="left"/>
+        <w:rPr>
+          <w:rFonts w:ascii="Cambria" w:hAnsi="Cambria" w:cs="Cambria" w:eastAsia="Cambria"/>
+          <w:color w:val="auto"/>
+          <w:spacing w:val="0"/>
+          <w:position w:val="0"/>
+          <w:sz w:val="22"/>
+          <w:shd w:fill="auto" w:val="clear"/>
+        </w:rPr>
+      </w:pPr>
     </w:p>
     <w:p>
       <w:pPr>

</xml_diff>